<commit_message>
fix(phase26-s-1): парные теги {% for %}/{% endfor %} в service_note_advance template
В add_body_advance использовался синтаксис {% tr for %}/{% tr endfor %} (для строк
таблиц), но таблицы в этом блоке нет — только параграфы. docxtpl валился с ошибкой
«Проверьте парные теги». Заменено на обычный {% for %}/{% endfor %}.

Co-Authored-By: Claude Sonnet 4.6 <noreply@anthropic.com>
</commit_message>
<xml_diff>
--- a/backend/templates/service_note_advance.docx
+++ b/backend/templates/service_note_advance.docx
@@ -463,7 +463,7 @@
           <w:color w:val="6B7280"/>
           <w:sz w:val="20"/>
         </w:rPr>
-        <w:t>{% tr for item in items %}</w:t>
+        <w:t>{% for item in items %}</w:t>
       </w:r>
     </w:p>
     <w:p>
@@ -529,7 +529,67 @@
           <w:color w:val="6B7280"/>
           <w:sz w:val="20"/>
         </w:rPr>
-        <w:t>{% tr endfor %}</w:t>
+        <w:t>{% endfor %}</w:t>
+      </w:r>
+    </w:p>
+    <w:p>
+      <w:pPr>
+        <w:spacing w:before="80" w:after="40" w:line="276" w:lineRule="exact"/>
+        <w:jc w:val="both"/>
+      </w:pPr>
+      <w:r>
+        <w:rPr>
+          <w:rFonts w:ascii="Times New Roman" w:hAnsi="Times New Roman"/>
+          <w:b/>
+          <w:i w:val="0"/>
+          <w:sz w:val="24"/>
+        </w:rPr>
+        <w:t>Приложенные чеки:</w:t>
+      </w:r>
+    </w:p>
+    <w:p>
+      <w:pPr>
+        <w:spacing w:before="0" w:after="0" w:line="276" w:lineRule="exact"/>
+        <w:jc w:val="both"/>
+      </w:pPr>
+      <w:r>
+        <w:rPr>
+          <w:rFonts w:ascii="Times New Roman" w:hAnsi="Times New Roman"/>
+          <w:i/>
+          <w:color w:val="6B7280"/>
+          <w:sz w:val="20"/>
+        </w:rPr>
+        <w:t>{% for r in receipts %}</w:t>
+      </w:r>
+    </w:p>
+    <w:p>
+      <w:pPr>
+        <w:spacing w:before="0" w:after="40" w:line="276" w:lineRule="exact"/>
+        <w:jc w:val="both"/>
+      </w:pPr>
+      <w:r>
+        <w:rPr>
+          <w:rFonts w:ascii="Times New Roman" w:hAnsi="Times New Roman"/>
+          <w:b/>
+          <w:color w:val="1E40AF"/>
+          <w:sz w:val="24"/>
+        </w:rPr>
+        <w:t>{{ r }}</w:t>
+      </w:r>
+    </w:p>
+    <w:p>
+      <w:pPr>
+        <w:spacing w:before="0" w:after="120" w:line="276" w:lineRule="exact"/>
+        <w:jc w:val="both"/>
+      </w:pPr>
+      <w:r>
+        <w:rPr>
+          <w:rFonts w:ascii="Times New Roman" w:hAnsi="Times New Roman"/>
+          <w:i/>
+          <w:color w:val="6B7280"/>
+          <w:sz w:val="20"/>
+        </w:rPr>
+        <w:t>{% endfor %}</w:t>
       </w:r>
     </w:p>
     <w:p/>

</xml_diff>

<commit_message>
feat(phase26-rr): чеки в таблице 1×2 со split left/right (без {% tr %})
Идея пользователя: «вставить туда табличку и уже в ней перебором».

Решение по Lessons.md (без {% tr %}):
- Шаблон: статичная таблица 1×2, по 7.5 см на ячейку. В левой ячейке —
  {% for r in left_receipts %}{{ r }}{% endfor %}, в правой —
  {% for r in right_receipts %}...{% endfor %}.
- Backend: receipts разделяются на 2 потока через slicing:
    left_receipts = receipt_images[::2]   # чётные индексы: 1,3,5...
    right_receipts = receipt_images[1::2] # нечётные: 2,4,6...
- Inline images 6.5 см ширины — comfortable wrap внутри ячейки.
- Smoke-render с пустым receipts: RENDER OK (без TemplateSyntaxError).

Tags: if=1/1 for=3/3 tr=0. Запрет {% tr %} соблюдён.

Co-Authored-By: Claude Opus 4.7 (1M context) <noreply@anthropic.com>
</commit_message>
<xml_diff>
--- a/backend/templates/service_note_advance.docx
+++ b/backend/templates/service_note_advance.docx
@@ -547,51 +547,113 @@
         <w:t>Приложенные чеки:</w:t>
       </w:r>
     </w:p>
-    <w:p>
-      <w:pPr>
-        <w:spacing w:before="0" w:after="0" w:line="276" w:lineRule="exact"/>
-        <w:jc w:val="both"/>
-      </w:pPr>
-      <w:r>
-        <w:rPr>
-          <w:rFonts w:ascii="Times New Roman" w:hAnsi="Times New Roman"/>
-          <w:i/>
-          <w:color w:val="6B7280"/>
-          <w:sz w:val="20"/>
-        </w:rPr>
-        <w:t>{% for r in receipts %}</w:t>
-      </w:r>
-    </w:p>
-    <w:p>
-      <w:pPr>
-        <w:spacing w:before="0" w:after="80" w:line="276" w:lineRule="exact"/>
-        <w:jc w:val="center"/>
-      </w:pPr>
-      <w:r>
-        <w:rPr>
-          <w:rFonts w:ascii="Times New Roman" w:hAnsi="Times New Roman"/>
-          <w:b/>
-          <w:color w:val="1E40AF"/>
-          <w:sz w:val="20"/>
-        </w:rPr>
-        <w:t>{{ r }}</w:t>
-      </w:r>
-    </w:p>
-    <w:p>
-      <w:pPr>
-        <w:spacing w:before="0" w:after="80" w:line="276" w:lineRule="exact"/>
-        <w:jc w:val="both"/>
-      </w:pPr>
-      <w:r>
-        <w:rPr>
-          <w:rFonts w:ascii="Times New Roman" w:hAnsi="Times New Roman"/>
-          <w:i/>
-          <w:color w:val="6B7280"/>
-          <w:sz w:val="20"/>
-        </w:rPr>
-        <w:t>{% endfor %}</w:t>
-      </w:r>
-    </w:p>
+    <w:tbl>
+      <w:tblPr>
+        <w:tblW w:type="auto" w:w="0"/>
+        <w:tblLayout w:type="fixed"/>
+        <w:tblLook w:firstColumn="1" w:firstRow="1" w:lastColumn="0" w:lastRow="0" w:noHBand="0" w:noVBand="1" w:val="04A0"/>
+      </w:tblPr>
+      <w:tblGrid>
+        <w:gridCol w:w="4986"/>
+        <w:gridCol w:w="4986"/>
+      </w:tblGrid>
+      <w:tr>
+        <w:tc>
+          <w:tcPr>
+            <w:tcW w:type="dxa" w:w="4252"/>
+          </w:tcPr>
+          <w:p>
+            <w:pPr>
+              <w:jc w:val="center"/>
+            </w:pPr>
+            <w:r>
+              <w:rPr>
+                <w:rFonts w:ascii="Times New Roman" w:hAnsi="Times New Roman"/>
+                <w:i/>
+                <w:color w:val="6B7280"/>
+                <w:sz w:val="20"/>
+              </w:rPr>
+              <w:t>{% for r in left_receipts %}</w:t>
+            </w:r>
+          </w:p>
+          <w:p>
+            <w:pPr>
+              <w:jc w:val="center"/>
+            </w:pPr>
+            <w:r>
+              <w:rPr>
+                <w:rFonts w:ascii="Times New Roman" w:hAnsi="Times New Roman"/>
+                <w:b/>
+                <w:color w:val="1E40AF"/>
+                <w:sz w:val="20"/>
+              </w:rPr>
+              <w:t>{{ r }}</w:t>
+            </w:r>
+          </w:p>
+          <w:p>
+            <w:pPr>
+              <w:jc w:val="center"/>
+            </w:pPr>
+            <w:r>
+              <w:rPr>
+                <w:rFonts w:ascii="Times New Roman" w:hAnsi="Times New Roman"/>
+                <w:i/>
+                <w:color w:val="6B7280"/>
+                <w:sz w:val="20"/>
+              </w:rPr>
+              <w:t>{% endfor %}</w:t>
+            </w:r>
+          </w:p>
+        </w:tc>
+        <w:tc>
+          <w:tcPr>
+            <w:tcW w:type="dxa" w:w="4252"/>
+          </w:tcPr>
+          <w:p>
+            <w:pPr>
+              <w:jc w:val="center"/>
+            </w:pPr>
+            <w:r>
+              <w:rPr>
+                <w:rFonts w:ascii="Times New Roman" w:hAnsi="Times New Roman"/>
+                <w:i/>
+                <w:color w:val="6B7280"/>
+                <w:sz w:val="20"/>
+              </w:rPr>
+              <w:t>{% for r in right_receipts %}</w:t>
+            </w:r>
+          </w:p>
+          <w:p>
+            <w:pPr>
+              <w:jc w:val="center"/>
+            </w:pPr>
+            <w:r>
+              <w:rPr>
+                <w:rFonts w:ascii="Times New Roman" w:hAnsi="Times New Roman"/>
+                <w:b/>
+                <w:color w:val="1E40AF"/>
+                <w:sz w:val="20"/>
+              </w:rPr>
+              <w:t>{{ r }}</w:t>
+            </w:r>
+          </w:p>
+          <w:p>
+            <w:pPr>
+              <w:jc w:val="center"/>
+            </w:pPr>
+            <w:r>
+              <w:rPr>
+                <w:rFonts w:ascii="Times New Roman" w:hAnsi="Times New Roman"/>
+                <w:i/>
+                <w:color w:val="6B7280"/>
+                <w:sz w:val="20"/>
+              </w:rPr>
+              <w:t>{% endfor %}</w:t>
+            </w:r>
+          </w:p>
+        </w:tc>
+      </w:tr>
+    </w:tbl>
     <w:p/>
     <w:p>
       <w:pPr>

</xml_diff>